<commit_message>
Prepare Zenodo preprint publication package
</commit_message>
<xml_diff>
--- a/Study_Hours_Marks_Prediction_IEEE_Research_Paper.docx
+++ b/Study_Hours_Marks_Prediction_IEEE_Research_Paper.docx
@@ -34,7 +34,7 @@
     </w:p>
     <w:p>
       <w:pPr>
-        <w:spacing w:after="200"/>
+        <w:spacing w:after="60"/>
         <w:jc w:val="center"/>
       </w:pPr>
       <w:r>
@@ -45,6 +45,36 @@
           <w:sz w:val="20"/>
         </w:rPr>
         <w:t>Independent Student Researcher</w:t>
+      </w:r>
+    </w:p>
+    <w:p>
+      <w:pPr>
+        <w:spacing w:after="40"/>
+        <w:jc w:val="center"/>
+      </w:pPr>
+      <w:r>
+        <w:rPr>
+          <w:rFonts w:ascii="Times New Roman" w:hAnsi="Times New Roman"/>
+          <w:b/>
+          <w:i w:val="0"/>
+          <w:sz w:val="18"/>
+        </w:rPr>
+        <w:t>PREPRINT | Version 1.0 | June 25, 2026 | Not peer reviewed</w:t>
+      </w:r>
+    </w:p>
+    <w:p>
+      <w:pPr>
+        <w:spacing w:after="160"/>
+        <w:jc w:val="center"/>
+      </w:pPr>
+      <w:r>
+        <w:rPr>
+          <w:rFonts w:ascii="Times New Roman" w:hAnsi="Times New Roman"/>
+          <w:b w:val="0"/>
+          <w:i/>
+          <w:sz w:val="16"/>
+        </w:rPr>
+        <w:t>Licensed under Creative Commons Attribution 4.0 International (CC BY 4.0)</w:t>
       </w:r>
     </w:p>
     <w:p>
@@ -2247,6 +2277,255 @@
           <w:smallCaps/>
           <w:sz w:val="20"/>
         </w:rPr>
+        <w:t>X. PUBLICATION STATEMENTS</w:t>
+      </w:r>
+    </w:p>
+    <w:p>
+      <w:pPr>
+        <w:pStyle w:val="Heading2"/>
+        <w:keepNext/>
+        <w:spacing w:before="100" w:after="20"/>
+      </w:pPr>
+      <w:r>
+        <w:rPr>
+          <w:rFonts w:ascii="Times New Roman" w:hAnsi="Times New Roman"/>
+          <w:b w:val="0"/>
+          <w:i/>
+          <w:sz w:val="20"/>
+        </w:rPr>
+        <w:t>A. Data Availability</w:t>
+      </w:r>
+    </w:p>
+    <w:p>
+      <w:pPr>
+        <w:spacing w:line="240" w:lineRule="auto" w:after="60"/>
+        <w:ind w:firstLine="202"/>
+        <w:jc w:val="both"/>
+        <w:widowControl/>
+      </w:pPr>
+      <w:r>
+        <w:rPr>
+          <w:rFonts w:ascii="Times New Roman" w:hAnsi="Times New Roman"/>
+          <w:b w:val="0"/>
+          <w:i w:val="0"/>
+          <w:sz w:val="20"/>
+        </w:rPr>
+        <w:t>The complete synthetic data set is included with this publication as study_hours_marks_dataset.csv. No real student data was collected or used.</w:t>
+      </w:r>
+    </w:p>
+    <w:p>
+      <w:pPr>
+        <w:pStyle w:val="Heading2"/>
+        <w:keepNext/>
+        <w:spacing w:before="100" w:after="20"/>
+      </w:pPr>
+      <w:r>
+        <w:rPr>
+          <w:rFonts w:ascii="Times New Roman" w:hAnsi="Times New Roman"/>
+          <w:b w:val="0"/>
+          <w:i/>
+          <w:sz w:val="20"/>
+        </w:rPr>
+        <w:t>B. Code Availability</w:t>
+      </w:r>
+    </w:p>
+    <w:p>
+      <w:pPr>
+        <w:spacing w:line="240" w:lineRule="auto" w:after="60"/>
+        <w:ind w:firstLine="202"/>
+        <w:jc w:val="both"/>
+        <w:widowControl/>
+      </w:pPr>
+      <w:r>
+        <w:rPr>
+          <w:rFonts w:ascii="Times New Roman" w:hAnsi="Times New Roman"/>
+          <w:b w:val="0"/>
+          <w:i w:val="0"/>
+          <w:sz w:val="20"/>
+        </w:rPr>
+        <w:t>The Python source code, unit tests, research evaluation script, dependency list, README file, graph, and document builders are included with this publication. No public code repository link was available when Version 1.0 was prepared.</w:t>
+      </w:r>
+    </w:p>
+    <w:p>
+      <w:pPr>
+        <w:pStyle w:val="Heading2"/>
+        <w:keepNext/>
+        <w:spacing w:before="100" w:after="20"/>
+      </w:pPr>
+      <w:r>
+        <w:rPr>
+          <w:rFonts w:ascii="Times New Roman" w:hAnsi="Times New Roman"/>
+          <w:b w:val="0"/>
+          <w:i/>
+          <w:sz w:val="20"/>
+        </w:rPr>
+        <w:t>C. Funding</w:t>
+      </w:r>
+    </w:p>
+    <w:p>
+      <w:pPr>
+        <w:spacing w:line="240" w:lineRule="auto" w:after="60"/>
+        <w:ind w:firstLine="202"/>
+        <w:jc w:val="both"/>
+        <w:widowControl/>
+      </w:pPr>
+      <w:r>
+        <w:rPr>
+          <w:rFonts w:ascii="Times New Roman" w:hAnsi="Times New Roman"/>
+          <w:b w:val="0"/>
+          <w:i w:val="0"/>
+          <w:sz w:val="20"/>
+        </w:rPr>
+        <w:t>This work received no grant, sponsor payment, or other external funding.</w:t>
+      </w:r>
+    </w:p>
+    <w:p>
+      <w:pPr>
+        <w:pStyle w:val="Heading2"/>
+        <w:keepNext/>
+        <w:spacing w:before="100" w:after="20"/>
+      </w:pPr>
+      <w:r>
+        <w:rPr>
+          <w:rFonts w:ascii="Times New Roman" w:hAnsi="Times New Roman"/>
+          <w:b w:val="0"/>
+          <w:i/>
+          <w:sz w:val="20"/>
+        </w:rPr>
+        <w:t>D. Conflict of Interest</w:t>
+      </w:r>
+    </w:p>
+    <w:p>
+      <w:pPr>
+        <w:spacing w:line="240" w:lineRule="auto" w:after="60"/>
+        <w:ind w:firstLine="202"/>
+        <w:jc w:val="both"/>
+        <w:widowControl/>
+      </w:pPr>
+      <w:r>
+        <w:rPr>
+          <w:rFonts w:ascii="Times New Roman" w:hAnsi="Times New Roman"/>
+          <w:b w:val="0"/>
+          <w:i w:val="0"/>
+          <w:sz w:val="20"/>
+        </w:rPr>
+        <w:t>The author declares no conflict of interest.</w:t>
+      </w:r>
+    </w:p>
+    <w:p>
+      <w:pPr>
+        <w:pStyle w:val="Heading2"/>
+        <w:keepNext/>
+        <w:spacing w:before="100" w:after="20"/>
+      </w:pPr>
+      <w:r>
+        <w:rPr>
+          <w:rFonts w:ascii="Times New Roman" w:hAnsi="Times New Roman"/>
+          <w:b w:val="0"/>
+          <w:i/>
+          <w:sz w:val="20"/>
+        </w:rPr>
+        <w:t>E. Author Contribution</w:t>
+      </w:r>
+    </w:p>
+    <w:p>
+      <w:pPr>
+        <w:spacing w:line="240" w:lineRule="auto" w:after="60"/>
+        <w:ind w:firstLine="202"/>
+        <w:jc w:val="both"/>
+        <w:widowControl/>
+      </w:pPr>
+      <w:r>
+        <w:rPr>
+          <w:rFonts w:ascii="Times New Roman" w:hAnsi="Times New Roman"/>
+          <w:b w:val="0"/>
+          <w:i w:val="0"/>
+          <w:sz w:val="20"/>
+        </w:rPr>
+        <w:t>Suvodeep Roy designed the project, reviewed the source code, checked the results, interpreted the findings, and approved the final paper.</w:t>
+      </w:r>
+    </w:p>
+    <w:p>
+      <w:pPr>
+        <w:pStyle w:val="Heading2"/>
+        <w:keepNext/>
+        <w:spacing w:before="100" w:after="20"/>
+      </w:pPr>
+      <w:r>
+        <w:rPr>
+          <w:rFonts w:ascii="Times New Roman" w:hAnsi="Times New Roman"/>
+          <w:b w:val="0"/>
+          <w:i/>
+          <w:sz w:val="20"/>
+        </w:rPr>
+        <w:t>F. AI Assistance Disclosure</w:t>
+      </w:r>
+    </w:p>
+    <w:p>
+      <w:pPr>
+        <w:spacing w:line="240" w:lineRule="auto" w:after="60"/>
+        <w:ind w:firstLine="202"/>
+        <w:jc w:val="both"/>
+        <w:widowControl/>
+      </w:pPr>
+      <w:r>
+        <w:rPr>
+          <w:rFonts w:ascii="Times New Roman" w:hAnsi="Times New Roman"/>
+          <w:b w:val="0"/>
+          <w:i w:val="0"/>
+          <w:sz w:val="20"/>
+        </w:rPr>
+        <w:t>OpenAI Codex assisted with code review, language editing, document layout, and preparation of supporting files. The author directed the work, reviewed the content, checked the reported results, and remains responsible for the final publication.</w:t>
+      </w:r>
+    </w:p>
+    <w:p>
+      <w:pPr>
+        <w:pStyle w:val="Heading2"/>
+        <w:keepNext/>
+        <w:spacing w:before="100" w:after="20"/>
+      </w:pPr>
+      <w:r>
+        <w:rPr>
+          <w:rFonts w:ascii="Times New Roman" w:hAnsi="Times New Roman"/>
+          <w:b w:val="0"/>
+          <w:i/>
+          <w:sz w:val="20"/>
+        </w:rPr>
+        <w:t>G. Licence and Peer-Review Status</w:t>
+      </w:r>
+    </w:p>
+    <w:p>
+      <w:pPr>
+        <w:spacing w:line="240" w:lineRule="auto" w:after="60"/>
+        <w:ind w:firstLine="202"/>
+        <w:jc w:val="both"/>
+        <w:widowControl/>
+      </w:pPr>
+      <w:r>
+        <w:rPr>
+          <w:rFonts w:ascii="Times New Roman" w:hAnsi="Times New Roman"/>
+          <w:b w:val="0"/>
+          <w:i w:val="0"/>
+          <w:sz w:val="20"/>
+        </w:rPr>
+        <w:t>This is Version 1.0 of an educational preprint. It has not been peer reviewed. The work is released under the Creative Commons Attribution 4.0 International licence.</w:t>
+      </w:r>
+    </w:p>
+    <w:p>
+      <w:pPr>
+        <w:pStyle w:val="Heading1"/>
+        <w:keepNext/>
+        <w:spacing w:before="140" w:after="60"/>
+        <w:jc w:val="center"/>
+      </w:pPr>
+      <w:r>
+        <w:rPr>
+          <w:rFonts w:ascii="Times New Roman" w:hAnsi="Times New Roman"/>
+          <w:b w:val="0"/>
+          <w:i w:val="0"/>
+          <w:smallCaps/>
+          <w:sz w:val="20"/>
+        </w:rPr>
         <w:t>REFERENCES</w:t>
       </w:r>
     </w:p>

</xml_diff>

<commit_message>
Add reserved Zenodo DOI to publication package
</commit_message>
<xml_diff>
--- a/Study_Hours_Marks_Prediction_IEEE_Research_Paper.docx
+++ b/Study_Hours_Marks_Prediction_IEEE_Research_Paper.docx
@@ -59,7 +59,22 @@
           <w:i w:val="0"/>
           <w:sz w:val="18"/>
         </w:rPr>
-        <w:t>PREPRINT | Version 1.0 | June 25, 2026 | Not peer reviewed</w:t>
+        <w:t>PREPRINT | Version 1.0 | June 26, 2026 | Not peer reviewed</w:t>
+      </w:r>
+    </w:p>
+    <w:p>
+      <w:pPr>
+        <w:spacing w:after="40"/>
+        <w:jc w:val="center"/>
+      </w:pPr>
+      <w:r>
+        <w:rPr>
+          <w:rFonts w:ascii="Times New Roman" w:hAnsi="Times New Roman"/>
+          <w:b w:val="0"/>
+          <w:i w:val="0"/>
+          <w:sz w:val="16"/>
+        </w:rPr>
+        <w:t>DOI: 10.5281/zenodo.20911341</w:t>
       </w:r>
     </w:p>
     <w:p>
@@ -2508,7 +2523,7 @@
           <w:i w:val="0"/>
           <w:sz w:val="20"/>
         </w:rPr>
-        <w:t>This is Version 1.0 of an educational preprint. It has not been peer reviewed. The work is released under the Creative Commons Attribution 4.0 International licence.</w:t>
+        <w:t>This is Version 1.0 of an educational preprint. It has not been peer reviewed. The work is released under the Creative Commons Attribution 4.0 International licence. The reserved Zenodo DOI is https://doi.org/10.5281/zenodo.20911341.</w:t>
       </w:r>
     </w:p>
     <w:p>

</xml_diff>